<commit_message>
Converte il template biennio per docxtpl e aggiunge programmazione 1 Scientifico SA
Il template MOD_INS_01_A (classi 1-2) era ancora il modulo istituzionale
grezzo, senza alcun tag Jinja: viene ora convertito con le stesse
convenzioni del template triennio (tabella UFC a 9 colonne, checkbox
testuali su classe PRIMA/SECONDA e indirizzo), aggiungendo anche le
opzioni Scienze Applicate e Informatica al Liceo Scientifico, assenti
nel modulo originale.

Aggiunge la programmazione di Informatica per la classe 1 Liceo
Scientifico Scienze Applicate, strutturata sulla sequenza temporale e
gli obiettivi minimi di programmazione_informatica_classe1_cpp.md, con
riferimenti DigComp 3.0 e CINI (O-S-*, i codici ufficiali per il
biennio delle superiori) verificati contro i documenti in
docs/riferimenti/.

Co-Authored-By: Claude Sonnet 5 <noreply@anthropic.com>
Claude-Session: https://claude.ai/code/session_01RhiSrAvzQjuRzvs6PB6TeD
</commit_message>
<xml_diff>
--- a/templates/MOD_INS_01_A REV.02 Programm. Dipart. Biennio.docx
+++ b/templates/MOD_INS_01_A REV.02 Programm. Dipart. Biennio.docx
@@ -162,7 +162,22 @@
               <w:right w:w="80" w:type="dxa"/>
             </w:tcMar>
           </w:tcPr>
-          <w:p/>
+          <w:p>
+            <w:pPr>
+              <w:jc w:val="center"/>
+              <w:rPr>
+                <w:rFonts w:ascii="Calibri" w:eastAsia="Calibri" w:hAnsi="Calibri" w:cs="Calibri"/>
+                <w:b/>
+              </w:rPr>
+            </w:pPr>
+            <w:r>
+              <w:rPr>
+                <w:rFonts w:ascii="Calibri" w:eastAsia="Calibri" w:hAnsi="Calibri" w:cs="Calibri"/>
+                <w:b/>
+              </w:rPr>
+              <w:t xml:space="preserve">INFORMATICA</w:t>
+            </w:r>
+          </w:p>
         </w:tc>
         <w:tc>
           <w:tcPr>
@@ -184,421 +199,69 @@
           </w:tcPr>
           <w:p>
             <w:pPr>
+              <w:rPr>
+                <w:rFonts w:ascii="Calibri" w:eastAsia="Calibri" w:hAnsi="Calibri" w:cs="Calibri"/>
+                <w:b/>
+              </w:rPr>
+            </w:pPr>
+            <w:r>
+              <w:rPr>
+                <w:rFonts w:ascii="Calibri" w:eastAsia="Calibri" w:hAnsi="Calibri" w:cs="Calibri"/>
+                <w:b/>
+              </w:rPr>
+              <w:t xml:space="preserve">{% if classe == 'PRIMA' %}▣{% else %}☐{% endif %} PRIMA</w:t>
+            </w:r>
+          </w:p>
+          <w:p>
+            <w:pPr>
+              <w:rPr>
+                <w:rFonts w:ascii="Calibri" w:eastAsia="Calibri" w:hAnsi="Calibri" w:cs="Calibri"/>
+                <w:b/>
+              </w:rPr>
+            </w:pPr>
+            <w:r>
+              <w:rPr>
+                <w:rFonts w:ascii="Calibri" w:eastAsia="Calibri" w:hAnsi="Calibri" w:cs="Calibri"/>
+                <w:b/>
+              </w:rPr>
+              <w:t xml:space="preserve">{% if classe == 'SECONDA' %}▣{% else %}☐{% endif %} SECONDA</w:t>
+            </w:r>
+          </w:p>
+        </w:tc>
+        <w:tc>
+          <w:tcPr>
+            <w:tcW w:w="1695" w:type="dxa"/>
+            <w:tcBorders>
+              <w:top w:val="single" w:sz="4" w:space="0" w:color="000000"/>
+              <w:left w:val="single" w:sz="4" w:space="0" w:color="000000"/>
+              <w:bottom w:val="single" w:sz="4" w:space="0" w:color="000000"/>
+              <w:right w:val="single" w:sz="4" w:space="0" w:color="000000"/>
+            </w:tcBorders>
+            <w:shd w:val="clear" w:color="auto" w:fill="auto"/>
+            <w:tcMar>
+              <w:top w:w="80" w:type="dxa"/>
+              <w:left w:w="80" w:type="dxa"/>
+              <w:bottom w:w="80" w:type="dxa"/>
+              <w:right w:w="80" w:type="dxa"/>
+            </w:tcMar>
+            <w:vAlign w:val="center"/>
+          </w:tcPr>
+          <w:p>
+            <w:pPr>
               <w:jc w:val="center"/>
               <w:rPr>
                 <w:rFonts w:ascii="Calibri" w:eastAsia="Calibri" w:hAnsi="Calibri" w:cs="Calibri"/>
                 <w:b/>
               </w:rPr>
             </w:pPr>
-          </w:p>
-          <w:p>
-            <w:pPr>
-              <w:rPr>
-                <w:rFonts w:ascii="Calibri" w:eastAsia="Calibri" w:hAnsi="Calibri" w:cs="Calibri"/>
-                <w:b/>
-              </w:rPr>
-            </w:pPr>
-            <w:r>
-              <w:rPr>
-                <w:rFonts w:ascii="Calibri" w:eastAsia="Calibri" w:hAnsi="Calibri" w:cs="Calibri"/>
-                <w:b/>
-                <w:noProof/>
-              </w:rPr>
-              <mc:AlternateContent>
-                <mc:Choice Requires="wpg">
-                  <w:drawing>
-                    <wp:inline distT="0" distB="0" distL="0" distR="0" wp14:anchorId="5852D06F" wp14:editId="7C131B38">
-                      <wp:extent cx="135255" cy="135255"/>
-                      <wp:effectExtent l="0" t="0" r="0" b="0"/>
-                      <wp:docPr id="1073741846" name="Rettangolo 1073741846"/>
-                      <wp:cNvGraphicFramePr/>
-                      <a:graphic xmlns:a="http://schemas.openxmlformats.org/drawingml/2006/main">
-                        <a:graphicData uri="http://schemas.microsoft.com/office/word/2010/wordprocessingShape">
-                          <wps:wsp>
-                            <wps:cNvSpPr/>
-                            <wps:spPr>
-                              <a:xfrm>
-                                <a:off x="5283135" y="3717135"/>
-                                <a:ext cx="125730" cy="125730"/>
-                              </a:xfrm>
-                              <a:prstGeom prst="rect">
-                                <a:avLst/>
-                              </a:prstGeom>
-                              <a:solidFill>
-                                <a:srgbClr val="FFFFFF"/>
-                              </a:solidFill>
-                              <a:ln w="9525" cap="flat" cmpd="sng">
-                                <a:solidFill>
-                                  <a:srgbClr val="000000"/>
-                                </a:solidFill>
-                                <a:prstDash val="solid"/>
-                                <a:round/>
-                                <a:headEnd type="none" w="sm" len="sm"/>
-                                <a:tailEnd type="none" w="sm" len="sm"/>
-                              </a:ln>
-                            </wps:spPr>
-                            <wps:txbx>
-                              <w:txbxContent>
-                                <w:p>
-                                  <w:pPr>
-                                    <w:textDirection w:val="btLr"/>
-                                  </w:pPr>
-                                </w:p>
-                              </w:txbxContent>
-                            </wps:txbx>
-                            <wps:bodyPr spcFirstLastPara="1" wrap="square" lIns="91425" tIns="91425" rIns="91425" bIns="91425" anchor="ctr" anchorCtr="0">
-                              <a:noAutofit/>
-                            </wps:bodyPr>
-                          </wps:wsp>
-                        </a:graphicData>
-                      </a:graphic>
-                    </wp:inline>
-                  </w:drawing>
-                </mc:Choice>
-                <mc:Fallback xmlns:dgm="http://schemas.openxmlformats.org/drawingml/2006/diagram" xmlns:lc="http://schemas.openxmlformats.org/drawingml/2006/lockedCanvas" xmlns:c="http://schemas.openxmlformats.org/drawingml/2006/chart" xmlns:pic="http://schemas.openxmlformats.org/drawingml/2006/picture" xmlns:a="http://schemas.openxmlformats.org/drawingml/2006/main" xmlns:sl="http://schemas.openxmlformats.org/schemaLibrary/2006/main">
-                  <w:drawing>
-                    <wp:inline distB="0" distT="0" distL="0" distR="0">
-                      <wp:extent cx="135255" cy="135255"/>
-                      <wp:effectExtent b="0" l="0" r="0" t="0"/>
-                      <wp:docPr id="1073741846" name="image6.png"/>
-                      <a:graphic>
-                        <a:graphicData uri="http://schemas.openxmlformats.org/drawingml/2006/picture">
-                          <pic:pic>
-                            <pic:nvPicPr>
-                              <pic:cNvPr id="0" name="image6.png"/>
-                              <pic:cNvPicPr preferRelativeResize="0"/>
-                            </pic:nvPicPr>
-                            <pic:blipFill>
-                              <a:blip r:embed="rId7"/>
-                              <a:srcRect/>
-                              <a:stretch>
-                                <a:fillRect/>
-                              </a:stretch>
-                            </pic:blipFill>
-                            <pic:spPr>
-                              <a:xfrm>
-                                <a:off x="0" y="0"/>
-                                <a:ext cx="135255" cy="135255"/>
-                              </a:xfrm>
-                              <a:prstGeom prst="rect"/>
-                              <a:ln/>
-                            </pic:spPr>
-                          </pic:pic>
-                        </a:graphicData>
-                      </a:graphic>
-                    </wp:inline>
-                  </w:drawing>
-                </mc:Fallback>
-              </mc:AlternateContent>
-            </w:r>
-            <w:r>
-              <w:rPr>
-                <w:rFonts w:ascii="Calibri" w:eastAsia="Calibri" w:hAnsi="Calibri" w:cs="Calibri"/>
-                <w:b/>
-                <w:noProof/>
-              </w:rPr>
-              <mc:AlternateContent>
-                <mc:Choice Requires="wpg">
-                  <w:drawing>
-                    <wp:inline distT="0" distB="0" distL="0" distR="0" wp14:anchorId="04083EF0" wp14:editId="4B633FF3">
-                      <wp:extent cx="135255" cy="135255"/>
-                      <wp:effectExtent l="0" t="0" r="0" b="0"/>
-                      <wp:docPr id="1073741845" name="Rettangolo 1073741845"/>
-                      <wp:cNvGraphicFramePr/>
-                      <a:graphic xmlns:a="http://schemas.openxmlformats.org/drawingml/2006/main">
-                        <a:graphicData uri="http://schemas.microsoft.com/office/word/2010/wordprocessingShape">
-                          <wps:wsp>
-                            <wps:cNvSpPr/>
-                            <wps:spPr>
-                              <a:xfrm>
-                                <a:off x="5283135" y="3717135"/>
-                                <a:ext cx="125730" cy="125730"/>
-                              </a:xfrm>
-                              <a:prstGeom prst="rect">
-                                <a:avLst/>
-                              </a:prstGeom>
-                              <a:noFill/>
-                              <a:ln>
-                                <a:noFill/>
-                              </a:ln>
-                            </wps:spPr>
-                            <wps:txbx>
-                              <w:txbxContent>
-                                <w:p>
-                                  <w:pPr>
-                                    <w:textDirection w:val="btLr"/>
-                                  </w:pPr>
-                                </w:p>
-                              </w:txbxContent>
-                            </wps:txbx>
-                            <wps:bodyPr spcFirstLastPara="1" wrap="square" lIns="91425" tIns="91425" rIns="91425" bIns="91425" anchor="ctr" anchorCtr="0">
-                              <a:noAutofit/>
-                            </wps:bodyPr>
-                          </wps:wsp>
-                        </a:graphicData>
-                      </a:graphic>
-                    </wp:inline>
-                  </w:drawing>
-                </mc:Choice>
-                <mc:Fallback xmlns:dgm="http://schemas.openxmlformats.org/drawingml/2006/diagram" xmlns:lc="http://schemas.openxmlformats.org/drawingml/2006/lockedCanvas" xmlns:c="http://schemas.openxmlformats.org/drawingml/2006/chart" xmlns:pic="http://schemas.openxmlformats.org/drawingml/2006/picture" xmlns:a="http://schemas.openxmlformats.org/drawingml/2006/main" xmlns:sl="http://schemas.openxmlformats.org/schemaLibrary/2006/main">
-                  <w:drawing>
-                    <wp:inline distB="0" distT="0" distL="0" distR="0">
-                      <wp:extent cx="135255" cy="135255"/>
-                      <wp:effectExtent b="0" l="0" r="0" t="0"/>
-                      <wp:docPr id="1073741845" name="image5.png"/>
-                      <a:graphic>
-                        <a:graphicData uri="http://schemas.openxmlformats.org/drawingml/2006/picture">
-                          <pic:pic>
-                            <pic:nvPicPr>
-                              <pic:cNvPr id="0" name="image5.png"/>
-                              <pic:cNvPicPr preferRelativeResize="0"/>
-                            </pic:nvPicPr>
-                            <pic:blipFill>
-                              <a:blip r:embed="rId8"/>
-                              <a:srcRect/>
-                              <a:stretch>
-                                <a:fillRect/>
-                              </a:stretch>
-                            </pic:blipFill>
-                            <pic:spPr>
-                              <a:xfrm>
-                                <a:off x="0" y="0"/>
-                                <a:ext cx="135255" cy="135255"/>
-                              </a:xfrm>
-                              <a:prstGeom prst="rect"/>
-                              <a:ln/>
-                            </pic:spPr>
-                          </pic:pic>
-                        </a:graphicData>
-                      </a:graphic>
-                    </wp:inline>
-                  </w:drawing>
-                </mc:Fallback>
-              </mc:AlternateContent>
-            </w:r>
-            <w:r>
-              <w:rPr>
-                <w:rFonts w:ascii="Calibri" w:eastAsia="Calibri" w:hAnsi="Calibri" w:cs="Calibri"/>
-                <w:b/>
-              </w:rPr>
-              <w:t xml:space="preserve">  PRIMA </w:t>
-            </w:r>
-          </w:p>
-          <w:p>
-            <w:pPr>
-              <w:rPr>
-                <w:rFonts w:ascii="Calibri" w:eastAsia="Calibri" w:hAnsi="Calibri" w:cs="Calibri"/>
-                <w:b/>
-              </w:rPr>
-            </w:pPr>
-          </w:p>
-          <w:p>
-            <w:r>
-              <w:rPr>
-                <w:rFonts w:ascii="Calibri" w:eastAsia="Calibri" w:hAnsi="Calibri" w:cs="Calibri"/>
-                <w:b/>
-                <w:noProof/>
-              </w:rPr>
-              <mc:AlternateContent>
-                <mc:Choice Requires="wpg">
-                  <w:drawing>
-                    <wp:inline distT="0" distB="0" distL="0" distR="0" wp14:anchorId="3999210C" wp14:editId="4295A60C">
-                      <wp:extent cx="135255" cy="135255"/>
-                      <wp:effectExtent l="0" t="0" r="0" b="0"/>
-                      <wp:docPr id="1073741849" name="Rettangolo 1073741849"/>
-                      <wp:cNvGraphicFramePr/>
-                      <a:graphic xmlns:a="http://schemas.openxmlformats.org/drawingml/2006/main">
-                        <a:graphicData uri="http://schemas.microsoft.com/office/word/2010/wordprocessingShape">
-                          <wps:wsp>
-                            <wps:cNvSpPr/>
-                            <wps:spPr>
-                              <a:xfrm>
-                                <a:off x="5283135" y="3717135"/>
-                                <a:ext cx="125730" cy="125730"/>
-                              </a:xfrm>
-                              <a:prstGeom prst="rect">
-                                <a:avLst/>
-                              </a:prstGeom>
-                              <a:solidFill>
-                                <a:srgbClr val="FFFFFF"/>
-                              </a:solidFill>
-                              <a:ln w="9525" cap="flat" cmpd="sng">
-                                <a:solidFill>
-                                  <a:srgbClr val="000000"/>
-                                </a:solidFill>
-                                <a:prstDash val="solid"/>
-                                <a:round/>
-                                <a:headEnd type="none" w="sm" len="sm"/>
-                                <a:tailEnd type="none" w="sm" len="sm"/>
-                              </a:ln>
-                            </wps:spPr>
-                            <wps:txbx>
-                              <w:txbxContent>
-                                <w:p>
-                                  <w:pPr>
-                                    <w:textDirection w:val="btLr"/>
-                                  </w:pPr>
-                                </w:p>
-                              </w:txbxContent>
-                            </wps:txbx>
-                            <wps:bodyPr spcFirstLastPara="1" wrap="square" lIns="91425" tIns="91425" rIns="91425" bIns="91425" anchor="ctr" anchorCtr="0">
-                              <a:noAutofit/>
-                            </wps:bodyPr>
-                          </wps:wsp>
-                        </a:graphicData>
-                      </a:graphic>
-                    </wp:inline>
-                  </w:drawing>
-                </mc:Choice>
-                <mc:Fallback xmlns:dgm="http://schemas.openxmlformats.org/drawingml/2006/diagram" xmlns:lc="http://schemas.openxmlformats.org/drawingml/2006/lockedCanvas" xmlns:c="http://schemas.openxmlformats.org/drawingml/2006/chart" xmlns:pic="http://schemas.openxmlformats.org/drawingml/2006/picture" xmlns:a="http://schemas.openxmlformats.org/drawingml/2006/main" xmlns:sl="http://schemas.openxmlformats.org/schemaLibrary/2006/main">
-                  <w:drawing>
-                    <wp:inline distB="0" distT="0" distL="0" distR="0">
-                      <wp:extent cx="135255" cy="135255"/>
-                      <wp:effectExtent b="0" l="0" r="0" t="0"/>
-                      <wp:docPr id="1073741849" name="image9.png"/>
-                      <a:graphic>
-                        <a:graphicData uri="http://schemas.openxmlformats.org/drawingml/2006/picture">
-                          <pic:pic>
-                            <pic:nvPicPr>
-                              <pic:cNvPr id="0" name="image9.png"/>
-                              <pic:cNvPicPr preferRelativeResize="0"/>
-                            </pic:nvPicPr>
-                            <pic:blipFill>
-                              <a:blip r:embed="rId9"/>
-                              <a:srcRect/>
-                              <a:stretch>
-                                <a:fillRect/>
-                              </a:stretch>
-                            </pic:blipFill>
-                            <pic:spPr>
-                              <a:xfrm>
-                                <a:off x="0" y="0"/>
-                                <a:ext cx="135255" cy="135255"/>
-                              </a:xfrm>
-                              <a:prstGeom prst="rect"/>
-                              <a:ln/>
-                            </pic:spPr>
-                          </pic:pic>
-                        </a:graphicData>
-                      </a:graphic>
-                    </wp:inline>
-                  </w:drawing>
-                </mc:Fallback>
-              </mc:AlternateContent>
-            </w:r>
-            <w:r>
-              <w:rPr>
-                <w:rFonts w:ascii="Calibri" w:eastAsia="Calibri" w:hAnsi="Calibri" w:cs="Calibri"/>
-                <w:b/>
-                <w:noProof/>
-              </w:rPr>
-              <mc:AlternateContent>
-                <mc:Choice Requires="wpg">
-                  <w:drawing>
-                    <wp:inline distT="0" distB="0" distL="0" distR="0" wp14:anchorId="020FE84A" wp14:editId="374F0EC3">
-                      <wp:extent cx="135255" cy="135255"/>
-                      <wp:effectExtent l="0" t="0" r="0" b="0"/>
-                      <wp:docPr id="1073741848" name="Rettangolo 1073741848"/>
-                      <wp:cNvGraphicFramePr/>
-                      <a:graphic xmlns:a="http://schemas.openxmlformats.org/drawingml/2006/main">
-                        <a:graphicData uri="http://schemas.microsoft.com/office/word/2010/wordprocessingShape">
-                          <wps:wsp>
-                            <wps:cNvSpPr/>
-                            <wps:spPr>
-                              <a:xfrm>
-                                <a:off x="5283135" y="3717135"/>
-                                <a:ext cx="125730" cy="125730"/>
-                              </a:xfrm>
-                              <a:prstGeom prst="rect">
-                                <a:avLst/>
-                              </a:prstGeom>
-                              <a:noFill/>
-                              <a:ln>
-                                <a:noFill/>
-                              </a:ln>
-                            </wps:spPr>
-                            <wps:txbx>
-                              <w:txbxContent>
-                                <w:p>
-                                  <w:pPr>
-                                    <w:textDirection w:val="btLr"/>
-                                  </w:pPr>
-                                </w:p>
-                              </w:txbxContent>
-                            </wps:txbx>
-                            <wps:bodyPr spcFirstLastPara="1" wrap="square" lIns="91425" tIns="91425" rIns="91425" bIns="91425" anchor="ctr" anchorCtr="0">
-                              <a:noAutofit/>
-                            </wps:bodyPr>
-                          </wps:wsp>
-                        </a:graphicData>
-                      </a:graphic>
-                    </wp:inline>
-                  </w:drawing>
-                </mc:Choice>
-                <mc:Fallback xmlns:dgm="http://schemas.openxmlformats.org/drawingml/2006/diagram" xmlns:lc="http://schemas.openxmlformats.org/drawingml/2006/lockedCanvas" xmlns:c="http://schemas.openxmlformats.org/drawingml/2006/chart" xmlns:pic="http://schemas.openxmlformats.org/drawingml/2006/picture" xmlns:a="http://schemas.openxmlformats.org/drawingml/2006/main" xmlns:sl="http://schemas.openxmlformats.org/schemaLibrary/2006/main">
-                  <w:drawing>
-                    <wp:inline distB="0" distT="0" distL="0" distR="0">
-                      <wp:extent cx="135255" cy="135255"/>
-                      <wp:effectExtent b="0" l="0" r="0" t="0"/>
-                      <wp:docPr id="1073741848" name="image8.png"/>
-                      <a:graphic>
-                        <a:graphicData uri="http://schemas.openxmlformats.org/drawingml/2006/picture">
-                          <pic:pic>
-                            <pic:nvPicPr>
-                              <pic:cNvPr id="0" name="image8.png"/>
-                              <pic:cNvPicPr preferRelativeResize="0"/>
-                            </pic:nvPicPr>
-                            <pic:blipFill>
-                              <a:blip r:embed="rId10"/>
-                              <a:srcRect/>
-                              <a:stretch>
-                                <a:fillRect/>
-                              </a:stretch>
-                            </pic:blipFill>
-                            <pic:spPr>
-                              <a:xfrm>
-                                <a:off x="0" y="0"/>
-                                <a:ext cx="135255" cy="135255"/>
-                              </a:xfrm>
-                              <a:prstGeom prst="rect"/>
-                              <a:ln/>
-                            </pic:spPr>
-                          </pic:pic>
-                        </a:graphicData>
-                      </a:graphic>
-                    </wp:inline>
-                  </w:drawing>
-                </mc:Fallback>
-              </mc:AlternateContent>
-            </w:r>
-            <w:r>
-              <w:rPr>
-                <w:rFonts w:ascii="Calibri" w:eastAsia="Calibri" w:hAnsi="Calibri" w:cs="Calibri"/>
-                <w:b/>
-              </w:rPr>
-              <w:t xml:space="preserve">  SECONDA</w:t>
-            </w:r>
-          </w:p>
-        </w:tc>
-        <w:tc>
-          <w:tcPr>
-            <w:tcW w:w="1695" w:type="dxa"/>
-            <w:tcBorders>
-              <w:top w:val="single" w:sz="4" w:space="0" w:color="000000"/>
-              <w:left w:val="single" w:sz="4" w:space="0" w:color="000000"/>
-              <w:bottom w:val="single" w:sz="4" w:space="0" w:color="000000"/>
-              <w:right w:val="single" w:sz="4" w:space="0" w:color="000000"/>
-            </w:tcBorders>
-            <w:shd w:val="clear" w:color="auto" w:fill="auto"/>
-            <w:tcMar>
-              <w:top w:w="80" w:type="dxa"/>
-              <w:left w:w="80" w:type="dxa"/>
-              <w:bottom w:w="80" w:type="dxa"/>
-              <w:right w:w="80" w:type="dxa"/>
-            </w:tcMar>
-            <w:vAlign w:val="center"/>
-          </w:tcPr>
-          <w:p/>
+            <w:r>
+              <w:rPr>
+                <w:rFonts w:ascii="Calibri" w:eastAsia="Calibri" w:hAnsi="Calibri" w:cs="Calibri"/>
+                <w:b/>
+              </w:rPr>
+              <w:t xml:space="preserve">{% if indirizzo == 'AFM' %}▣{% else %}☐{% endif %}</w:t>
+            </w:r>
+          </w:p>
         </w:tc>
         <w:tc>
           <w:tcPr>
@@ -1340,7 +1003,7 @@
                 <w:rFonts w:ascii="Calibri" w:eastAsia="Calibri" w:hAnsi="Calibri" w:cs="Calibri"/>
                 <w:b/>
               </w:rPr>
-              <w:t>LICEO SCIENTIFICO</w:t>
+              <w:t xml:space="preserve">LICEO SCIENTIFICO</w:t>
             </w:r>
           </w:p>
           <w:p>
@@ -1356,512 +1019,71 @@
                 <w:rFonts w:ascii="Calibri" w:eastAsia="Calibri" w:hAnsi="Calibri" w:cs="Calibri"/>
                 <w:b/>
               </w:rPr>
-              <w:t>OPZIONI:</w:t>
+              <w:t xml:space="preserve">OPZIONI:</w:t>
             </w:r>
           </w:p>
           <w:p>
             <w:pPr>
               <w:jc w:val="center"/>
+              <w:rPr>
+                <w:rFonts w:ascii="Calibri" w:eastAsia="Calibri" w:hAnsi="Calibri" w:cs="Calibri"/>
+                <w:b/>
+              </w:rPr>
             </w:pPr>
             <w:r>
               <w:rPr>
                 <w:rFonts w:ascii="Calibri" w:eastAsia="Calibri" w:hAnsi="Calibri" w:cs="Calibri"/>
                 <w:b/>
               </w:rPr>
-              <w:t xml:space="preserve">     </w:t>
-            </w:r>
-            <w:r>
-              <w:rPr>
-                <w:rFonts w:ascii="Calibri" w:eastAsia="Calibri" w:hAnsi="Calibri" w:cs="Calibri"/>
-                <w:b/>
-                <w:noProof/>
-              </w:rPr>
-              <mc:AlternateContent>
-                <mc:Choice Requires="wpg">
-                  <w:drawing>
-                    <wp:inline distT="0" distB="0" distL="0" distR="0" wp14:anchorId="40913727" wp14:editId="1DFDAA3D">
-                      <wp:extent cx="135255" cy="135255"/>
-                      <wp:effectExtent l="0" t="0" r="0" b="0"/>
-                      <wp:docPr id="1073741854" name="Rettangolo 1073741854"/>
-                      <wp:cNvGraphicFramePr/>
-                      <a:graphic xmlns:a="http://schemas.openxmlformats.org/drawingml/2006/main">
-                        <a:graphicData uri="http://schemas.microsoft.com/office/word/2010/wordprocessingShape">
-                          <wps:wsp>
-                            <wps:cNvSpPr/>
-                            <wps:spPr>
-                              <a:xfrm>
-                                <a:off x="5283135" y="3717135"/>
-                                <a:ext cx="125730" cy="125730"/>
-                              </a:xfrm>
-                              <a:prstGeom prst="rect">
-                                <a:avLst/>
-                              </a:prstGeom>
-                              <a:solidFill>
-                                <a:srgbClr val="FFFFFF"/>
-                              </a:solidFill>
-                              <a:ln w="9525" cap="flat" cmpd="sng">
-                                <a:solidFill>
-                                  <a:srgbClr val="000000"/>
-                                </a:solidFill>
-                                <a:prstDash val="solid"/>
-                                <a:round/>
-                                <a:headEnd type="none" w="sm" len="sm"/>
-                                <a:tailEnd type="none" w="sm" len="sm"/>
-                              </a:ln>
-                            </wps:spPr>
-                            <wps:txbx>
-                              <w:txbxContent>
-                                <w:p>
-                                  <w:pPr>
-                                    <w:textDirection w:val="btLr"/>
-                                  </w:pPr>
-                                </w:p>
-                              </w:txbxContent>
-                            </wps:txbx>
-                            <wps:bodyPr spcFirstLastPara="1" wrap="square" lIns="91425" tIns="91425" rIns="91425" bIns="91425" anchor="ctr" anchorCtr="0">
-                              <a:noAutofit/>
-                            </wps:bodyPr>
-                          </wps:wsp>
-                        </a:graphicData>
-                      </a:graphic>
-                    </wp:inline>
-                  </w:drawing>
-                </mc:Choice>
-                <mc:Fallback xmlns:dgm="http://schemas.openxmlformats.org/drawingml/2006/diagram" xmlns:lc="http://schemas.openxmlformats.org/drawingml/2006/lockedCanvas" xmlns:c="http://schemas.openxmlformats.org/drawingml/2006/chart" xmlns:pic="http://schemas.openxmlformats.org/drawingml/2006/picture" xmlns:a="http://schemas.openxmlformats.org/drawingml/2006/main" xmlns:sl="http://schemas.openxmlformats.org/schemaLibrary/2006/main">
-                  <w:drawing>
-                    <wp:inline distB="0" distT="0" distL="0" distR="0">
-                      <wp:extent cx="135255" cy="135255"/>
-                      <wp:effectExtent b="0" l="0" r="0" t="0"/>
-                      <wp:docPr id="1073741854" name="image14.png"/>
-                      <a:graphic>
-                        <a:graphicData uri="http://schemas.openxmlformats.org/drawingml/2006/picture">
-                          <pic:pic>
-                            <pic:nvPicPr>
-                              <pic:cNvPr id="0" name="image14.png"/>
-                              <pic:cNvPicPr preferRelativeResize="0"/>
-                            </pic:nvPicPr>
-                            <pic:blipFill>
-                              <a:blip r:embed="rId15"/>
-                              <a:srcRect/>
-                              <a:stretch>
-                                <a:fillRect/>
-                              </a:stretch>
-                            </pic:blipFill>
-                            <pic:spPr>
-                              <a:xfrm>
-                                <a:off x="0" y="0"/>
-                                <a:ext cx="135255" cy="135255"/>
-                              </a:xfrm>
-                              <a:prstGeom prst="rect"/>
-                              <a:ln/>
-                            </pic:spPr>
-                          </pic:pic>
-                        </a:graphicData>
-                      </a:graphic>
-                    </wp:inline>
-                  </w:drawing>
-                </mc:Fallback>
-              </mc:AlternateContent>
-            </w:r>
-            <w:r>
-              <w:rPr>
-                <w:rFonts w:ascii="Calibri" w:eastAsia="Calibri" w:hAnsi="Calibri" w:cs="Calibri"/>
-                <w:b/>
-              </w:rPr>
-              <w:t xml:space="preserve">     CORSO BASE       </w:t>
-            </w:r>
-            <w:r>
-              <w:rPr>
-                <w:rFonts w:ascii="Calibri" w:eastAsia="Calibri" w:hAnsi="Calibri" w:cs="Calibri"/>
-                <w:b/>
-                <w:noProof/>
-              </w:rPr>
-              <mc:AlternateContent>
-                <mc:Choice Requires="wpg">
-                  <w:drawing>
-                    <wp:inline distT="0" distB="0" distL="0" distR="0" wp14:anchorId="27789C2F" wp14:editId="590C8F7D">
-                      <wp:extent cx="135255" cy="135255"/>
-                      <wp:effectExtent l="0" t="0" r="0" b="0"/>
-                      <wp:docPr id="1073741847" name="Rettangolo 1073741847"/>
-                      <wp:cNvGraphicFramePr/>
-                      <a:graphic xmlns:a="http://schemas.openxmlformats.org/drawingml/2006/main">
-                        <a:graphicData uri="http://schemas.microsoft.com/office/word/2010/wordprocessingShape">
-                          <wps:wsp>
-                            <wps:cNvSpPr/>
-                            <wps:spPr>
-                              <a:xfrm>
-                                <a:off x="5283135" y="3717135"/>
-                                <a:ext cx="125730" cy="125730"/>
-                              </a:xfrm>
-                              <a:prstGeom prst="rect">
-                                <a:avLst/>
-                              </a:prstGeom>
-                              <a:solidFill>
-                                <a:srgbClr val="FFFFFF"/>
-                              </a:solidFill>
-                              <a:ln w="9525" cap="flat" cmpd="sng">
-                                <a:solidFill>
-                                  <a:srgbClr val="000000"/>
-                                </a:solidFill>
-                                <a:prstDash val="solid"/>
-                                <a:round/>
-                                <a:headEnd type="none" w="sm" len="sm"/>
-                                <a:tailEnd type="none" w="sm" len="sm"/>
-                              </a:ln>
-                            </wps:spPr>
-                            <wps:txbx>
-                              <w:txbxContent>
-                                <w:p>
-                                  <w:pPr>
-                                    <w:textDirection w:val="btLr"/>
-                                  </w:pPr>
-                                </w:p>
-                              </w:txbxContent>
-                            </wps:txbx>
-                            <wps:bodyPr spcFirstLastPara="1" wrap="square" lIns="91425" tIns="91425" rIns="91425" bIns="91425" anchor="ctr" anchorCtr="0">
-                              <a:noAutofit/>
-                            </wps:bodyPr>
-                          </wps:wsp>
-                        </a:graphicData>
-                      </a:graphic>
-                    </wp:inline>
-                  </w:drawing>
-                </mc:Choice>
-                <mc:Fallback xmlns:dgm="http://schemas.openxmlformats.org/drawingml/2006/diagram" xmlns:lc="http://schemas.openxmlformats.org/drawingml/2006/lockedCanvas" xmlns:c="http://schemas.openxmlformats.org/drawingml/2006/chart" xmlns:pic="http://schemas.openxmlformats.org/drawingml/2006/picture" xmlns:a="http://schemas.openxmlformats.org/drawingml/2006/main" xmlns:sl="http://schemas.openxmlformats.org/schemaLibrary/2006/main">
-                  <w:drawing>
-                    <wp:inline distB="0" distT="0" distL="0" distR="0">
-                      <wp:extent cx="135255" cy="135255"/>
-                      <wp:effectExtent b="0" l="0" r="0" t="0"/>
-                      <wp:docPr id="1073741847" name="image7.png"/>
-                      <a:graphic>
-                        <a:graphicData uri="http://schemas.openxmlformats.org/drawingml/2006/picture">
-                          <pic:pic>
-                            <pic:nvPicPr>
-                              <pic:cNvPr id="0" name="image7.png"/>
-                              <pic:cNvPicPr preferRelativeResize="0"/>
-                            </pic:nvPicPr>
-                            <pic:blipFill>
-                              <a:blip r:embed="rId16"/>
-                              <a:srcRect/>
-                              <a:stretch>
-                                <a:fillRect/>
-                              </a:stretch>
-                            </pic:blipFill>
-                            <pic:spPr>
-                              <a:xfrm>
-                                <a:off x="0" y="0"/>
-                                <a:ext cx="135255" cy="135255"/>
-                              </a:xfrm>
-                              <a:prstGeom prst="rect"/>
-                              <a:ln/>
-                            </pic:spPr>
-                          </pic:pic>
-                        </a:graphicData>
-                      </a:graphic>
-                    </wp:inline>
-                  </w:drawing>
-                </mc:Fallback>
-              </mc:AlternateContent>
-            </w:r>
-            <w:r>
-              <w:rPr>
-                <w:rFonts w:ascii="Calibri" w:eastAsia="Calibri" w:hAnsi="Calibri" w:cs="Calibri"/>
-                <w:b/>
-              </w:rPr>
-              <w:t xml:space="preserve">     CAMBRIDGE         </w:t>
-            </w:r>
-            <w:r>
-              <w:rPr>
-                <w:rFonts w:ascii="Calibri" w:eastAsia="Calibri" w:hAnsi="Calibri" w:cs="Calibri"/>
-                <w:b/>
-                <w:noProof/>
-              </w:rPr>
-              <mc:AlternateContent>
-                <mc:Choice Requires="wpg">
-                  <w:drawing>
-                    <wp:inline distT="0" distB="0" distL="0" distR="0" wp14:anchorId="51E99523" wp14:editId="090B3AAE">
-                      <wp:extent cx="135255" cy="135255"/>
-                      <wp:effectExtent l="0" t="0" r="0" b="0"/>
-                      <wp:docPr id="1073741844" name="Rettangolo 1073741844"/>
-                      <wp:cNvGraphicFramePr/>
-                      <a:graphic xmlns:a="http://schemas.openxmlformats.org/drawingml/2006/main">
-                        <a:graphicData uri="http://schemas.microsoft.com/office/word/2010/wordprocessingShape">
-                          <wps:wsp>
-                            <wps:cNvSpPr/>
-                            <wps:spPr>
-                              <a:xfrm>
-                                <a:off x="5283135" y="3717135"/>
-                                <a:ext cx="125730" cy="125730"/>
-                              </a:xfrm>
-                              <a:prstGeom prst="rect">
-                                <a:avLst/>
-                              </a:prstGeom>
-                              <a:solidFill>
-                                <a:srgbClr val="FFFFFF"/>
-                              </a:solidFill>
-                              <a:ln w="9525" cap="flat" cmpd="sng">
-                                <a:solidFill>
-                                  <a:srgbClr val="000000"/>
-                                </a:solidFill>
-                                <a:prstDash val="solid"/>
-                                <a:round/>
-                                <a:headEnd type="none" w="sm" len="sm"/>
-                                <a:tailEnd type="none" w="sm" len="sm"/>
-                              </a:ln>
-                            </wps:spPr>
-                            <wps:txbx>
-                              <w:txbxContent>
-                                <w:p>
-                                  <w:pPr>
-                                    <w:textDirection w:val="btLr"/>
-                                  </w:pPr>
-                                </w:p>
-                              </w:txbxContent>
-                            </wps:txbx>
-                            <wps:bodyPr spcFirstLastPara="1" wrap="square" lIns="91425" tIns="91425" rIns="91425" bIns="91425" anchor="ctr" anchorCtr="0">
-                              <a:noAutofit/>
-                            </wps:bodyPr>
-                          </wps:wsp>
-                        </a:graphicData>
-                      </a:graphic>
-                    </wp:inline>
-                  </w:drawing>
-                </mc:Choice>
-                <mc:Fallback xmlns:dgm="http://schemas.openxmlformats.org/drawingml/2006/diagram" xmlns:lc="http://schemas.openxmlformats.org/drawingml/2006/lockedCanvas" xmlns:c="http://schemas.openxmlformats.org/drawingml/2006/chart" xmlns:pic="http://schemas.openxmlformats.org/drawingml/2006/picture" xmlns:a="http://schemas.openxmlformats.org/drawingml/2006/main" xmlns:sl="http://schemas.openxmlformats.org/schemaLibrary/2006/main">
-                  <w:drawing>
-                    <wp:inline distB="0" distT="0" distL="0" distR="0">
-                      <wp:extent cx="135255" cy="135255"/>
-                      <wp:effectExtent b="0" l="0" r="0" t="0"/>
-                      <wp:docPr id="1073741844" name="image4.png"/>
-                      <a:graphic>
-                        <a:graphicData uri="http://schemas.openxmlformats.org/drawingml/2006/picture">
-                          <pic:pic>
-                            <pic:nvPicPr>
-                              <pic:cNvPr id="0" name="image4.png"/>
-                              <pic:cNvPicPr preferRelativeResize="0"/>
-                            </pic:nvPicPr>
-                            <pic:blipFill>
-                              <a:blip r:embed="rId17"/>
-                              <a:srcRect/>
-                              <a:stretch>
-                                <a:fillRect/>
-                              </a:stretch>
-                            </pic:blipFill>
-                            <pic:spPr>
-                              <a:xfrm>
-                                <a:off x="0" y="0"/>
-                                <a:ext cx="135255" cy="135255"/>
-                              </a:xfrm>
-                              <a:prstGeom prst="rect"/>
-                              <a:ln/>
-                            </pic:spPr>
-                          </pic:pic>
-                        </a:graphicData>
-                      </a:graphic>
-                    </wp:inline>
-                  </w:drawing>
-                </mc:Fallback>
-              </mc:AlternateContent>
-            </w:r>
-            <w:r>
-              <w:rPr>
-                <w:rFonts w:ascii="Calibri" w:eastAsia="Calibri" w:hAnsi="Calibri" w:cs="Calibri"/>
-                <w:b/>
-              </w:rPr>
-              <w:t xml:space="preserve">    SCIENZE APPLICATE </w:t>
-            </w:r>
-            <w:r>
-              <w:rPr>
-                <w:rFonts w:ascii="Calibri" w:eastAsia="Calibri" w:hAnsi="Calibri" w:cs="Calibri"/>
-                <w:b/>
-              </w:rPr>
-              <w:br/>
-              <w:t xml:space="preserve"> </w:t>
-            </w:r>
-            <w:r>
-              <w:rPr>
-                <w:rFonts w:ascii="Calibri" w:eastAsia="Calibri" w:hAnsi="Calibri" w:cs="Calibri"/>
-                <w:b/>
-                <w:noProof/>
-              </w:rPr>
-              <mc:AlternateContent>
-                <mc:Choice Requires="wpg">
-                  <w:drawing>
-                    <wp:inline distT="0" distB="0" distL="0" distR="0" wp14:anchorId="0ED6EC52" wp14:editId="6634C7B9">
-                      <wp:extent cx="135255" cy="135255"/>
-                      <wp:effectExtent l="0" t="0" r="0" b="0"/>
-                      <wp:docPr id="1073741843" name="Rettangolo 1073741843"/>
-                      <wp:cNvGraphicFramePr/>
-                      <a:graphic xmlns:a="http://schemas.openxmlformats.org/drawingml/2006/main">
-                        <a:graphicData uri="http://schemas.microsoft.com/office/word/2010/wordprocessingShape">
-                          <wps:wsp>
-                            <wps:cNvSpPr/>
-                            <wps:spPr>
-                              <a:xfrm>
-                                <a:off x="5283135" y="3717135"/>
-                                <a:ext cx="125730" cy="125730"/>
-                              </a:xfrm>
-                              <a:prstGeom prst="rect">
-                                <a:avLst/>
-                              </a:prstGeom>
-                              <a:solidFill>
-                                <a:srgbClr val="FFFFFF"/>
-                              </a:solidFill>
-                              <a:ln w="9525" cap="flat" cmpd="sng">
-                                <a:solidFill>
-                                  <a:srgbClr val="000000"/>
-                                </a:solidFill>
-                                <a:prstDash val="solid"/>
-                                <a:round/>
-                                <a:headEnd type="none" w="sm" len="sm"/>
-                                <a:tailEnd type="none" w="sm" len="sm"/>
-                              </a:ln>
-                            </wps:spPr>
-                            <wps:txbx>
-                              <w:txbxContent>
-                                <w:p>
-                                  <w:pPr>
-                                    <w:textDirection w:val="btLr"/>
-                                  </w:pPr>
-                                </w:p>
-                              </w:txbxContent>
-                            </wps:txbx>
-                            <wps:bodyPr spcFirstLastPara="1" wrap="square" lIns="91425" tIns="91425" rIns="91425" bIns="91425" anchor="ctr" anchorCtr="0">
-                              <a:noAutofit/>
-                            </wps:bodyPr>
-                          </wps:wsp>
-                        </a:graphicData>
-                      </a:graphic>
-                    </wp:inline>
-                  </w:drawing>
-                </mc:Choice>
-                <mc:Fallback xmlns:dgm="http://schemas.openxmlformats.org/drawingml/2006/diagram" xmlns:lc="http://schemas.openxmlformats.org/drawingml/2006/lockedCanvas" xmlns:c="http://schemas.openxmlformats.org/drawingml/2006/chart" xmlns:pic="http://schemas.openxmlformats.org/drawingml/2006/picture" xmlns:a="http://schemas.openxmlformats.org/drawingml/2006/main" xmlns:sl="http://schemas.openxmlformats.org/schemaLibrary/2006/main">
-                  <w:drawing>
-                    <wp:inline distB="0" distT="0" distL="0" distR="0">
-                      <wp:extent cx="135255" cy="135255"/>
-                      <wp:effectExtent b="0" l="0" r="0" t="0"/>
-                      <wp:docPr id="1073741843" name="image3.png"/>
-                      <a:graphic>
-                        <a:graphicData uri="http://schemas.openxmlformats.org/drawingml/2006/picture">
-                          <pic:pic>
-                            <pic:nvPicPr>
-                              <pic:cNvPr id="0" name="image3.png"/>
-                              <pic:cNvPicPr preferRelativeResize="0"/>
-                            </pic:nvPicPr>
-                            <pic:blipFill>
-                              <a:blip r:embed="rId18"/>
-                              <a:srcRect/>
-                              <a:stretch>
-                                <a:fillRect/>
-                              </a:stretch>
-                            </pic:blipFill>
-                            <pic:spPr>
-                              <a:xfrm>
-                                <a:off x="0" y="0"/>
-                                <a:ext cx="135255" cy="135255"/>
-                              </a:xfrm>
-                              <a:prstGeom prst="rect"/>
-                              <a:ln/>
-                            </pic:spPr>
-                          </pic:pic>
-                        </a:graphicData>
-                      </a:graphic>
-                    </wp:inline>
-                  </w:drawing>
-                </mc:Fallback>
-              </mc:AlternateContent>
-            </w:r>
-            <w:r>
-              <w:rPr>
-                <w:rFonts w:ascii="Calibri" w:eastAsia="Calibri" w:hAnsi="Calibri" w:cs="Calibri"/>
-                <w:b/>
-                <w:noProof/>
-              </w:rPr>
-              <mc:AlternateContent>
-                <mc:Choice Requires="wpg">
-                  <w:drawing>
-                    <wp:inline distT="0" distB="0" distL="0" distR="0" wp14:anchorId="11DEFE6B" wp14:editId="32D30C2A">
-                      <wp:extent cx="135255" cy="135255"/>
-                      <wp:effectExtent l="0" t="0" r="0" b="0"/>
-                      <wp:docPr id="1073741842" name="Rettangolo 1073741842"/>
-                      <wp:cNvGraphicFramePr/>
-                      <a:graphic xmlns:a="http://schemas.openxmlformats.org/drawingml/2006/main">
-                        <a:graphicData uri="http://schemas.microsoft.com/office/word/2010/wordprocessingShape">
-                          <wps:wsp>
-                            <wps:cNvSpPr/>
-                            <wps:spPr>
-                              <a:xfrm>
-                                <a:off x="5283135" y="3717135"/>
-                                <a:ext cx="125730" cy="125730"/>
-                              </a:xfrm>
-                              <a:prstGeom prst="rect">
-                                <a:avLst/>
-                              </a:prstGeom>
-                              <a:noFill/>
-                              <a:ln>
-                                <a:noFill/>
-                              </a:ln>
-                            </wps:spPr>
-                            <wps:txbx>
-                              <w:txbxContent>
-                                <w:p>
-                                  <w:pPr>
-                                    <w:textDirection w:val="btLr"/>
-                                  </w:pPr>
-                                </w:p>
-                              </w:txbxContent>
-                            </wps:txbx>
-                            <wps:bodyPr spcFirstLastPara="1" wrap="square" lIns="91425" tIns="91425" rIns="91425" bIns="91425" anchor="ctr" anchorCtr="0">
-                              <a:noAutofit/>
-                            </wps:bodyPr>
-                          </wps:wsp>
-                        </a:graphicData>
-                      </a:graphic>
-                    </wp:inline>
-                  </w:drawing>
-                </mc:Choice>
-                <mc:Fallback xmlns:dgm="http://schemas.openxmlformats.org/drawingml/2006/diagram" xmlns:lc="http://schemas.openxmlformats.org/drawingml/2006/lockedCanvas" xmlns:c="http://schemas.openxmlformats.org/drawingml/2006/chart" xmlns:pic="http://schemas.openxmlformats.org/drawingml/2006/picture" xmlns:a="http://schemas.openxmlformats.org/drawingml/2006/main" xmlns:sl="http://schemas.openxmlformats.org/schemaLibrary/2006/main">
-                  <w:drawing>
-                    <wp:inline distB="0" distT="0" distL="0" distR="0">
-                      <wp:extent cx="135255" cy="135255"/>
-                      <wp:effectExtent b="0" l="0" r="0" t="0"/>
-                      <wp:docPr id="1073741842" name="image2.png"/>
-                      <a:graphic>
-                        <a:graphicData uri="http://schemas.openxmlformats.org/drawingml/2006/picture">
-                          <pic:pic>
-                            <pic:nvPicPr>
-                              <pic:cNvPr id="0" name="image2.png"/>
-                              <pic:cNvPicPr preferRelativeResize="0"/>
-                            </pic:nvPicPr>
-                            <pic:blipFill>
-                              <a:blip r:embed="rId19"/>
-                              <a:srcRect/>
-                              <a:stretch>
-                                <a:fillRect/>
-                              </a:stretch>
-                            </pic:blipFill>
-                            <pic:spPr>
-                              <a:xfrm>
-                                <a:off x="0" y="0"/>
-                                <a:ext cx="135255" cy="135255"/>
-                              </a:xfrm>
-                              <a:prstGeom prst="rect"/>
-                              <a:ln/>
-                            </pic:spPr>
-                          </pic:pic>
-                        </a:graphicData>
-                      </a:graphic>
-                    </wp:inline>
-                  </w:drawing>
-                </mc:Fallback>
-              </mc:AlternateContent>
-            </w:r>
-            <w:r>
-              <w:rPr>
-                <w:rFonts w:ascii="Calibri" w:eastAsia="Calibri" w:hAnsi="Calibri" w:cs="Calibri"/>
-                <w:b/>
-              </w:rPr>
-              <w:t xml:space="preserve"> INFORMATICA </w:t>
+              <w:t xml:space="preserve">{% if indirizzo == 'SCIENTIFICO' %}▣{% else %}☐{% endif %} CORSO BASE</w:t>
+            </w:r>
+          </w:p>
+          <w:p>
+            <w:pPr>
+              <w:jc w:val="center"/>
+              <w:rPr>
+                <w:rFonts w:ascii="Calibri" w:eastAsia="Calibri" w:hAnsi="Calibri" w:cs="Calibri"/>
+                <w:b/>
+              </w:rPr>
+            </w:pPr>
+            <w:r>
+              <w:rPr>
+                <w:rFonts w:ascii="Calibri" w:eastAsia="Calibri" w:hAnsi="Calibri" w:cs="Calibri"/>
+                <w:b/>
+              </w:rPr>
+              <w:t xml:space="preserve">{% if indirizzo == 'SCIENTIFICO_CAMBRIDGE' %}▣{% else %}☐{% endif %} CAMBRIDGE</w:t>
+            </w:r>
+          </w:p>
+          <w:p>
+            <w:pPr>
+              <w:jc w:val="center"/>
+              <w:rPr>
+                <w:rFonts w:ascii="Calibri" w:eastAsia="Calibri" w:hAnsi="Calibri" w:cs="Calibri"/>
+                <w:b/>
+              </w:rPr>
+            </w:pPr>
+            <w:r>
+              <w:rPr>
+                <w:rFonts w:ascii="Calibri" w:eastAsia="Calibri" w:hAnsi="Calibri" w:cs="Calibri"/>
+                <w:b/>
+              </w:rPr>
+              <w:t xml:space="preserve">{% if indirizzo == 'SCIENTIFICO_SCIENZE_APPLICATE' %}▣{% else %}☐{% endif %} SCIENZE APPLICATE</w:t>
+            </w:r>
+          </w:p>
+          <w:p>
+            <w:pPr>
+              <w:jc w:val="center"/>
+              <w:rPr>
+                <w:rFonts w:ascii="Calibri" w:eastAsia="Calibri" w:hAnsi="Calibri" w:cs="Calibri"/>
+                <w:b/>
+              </w:rPr>
+            </w:pPr>
+            <w:r>
+              <w:rPr>
+                <w:rFonts w:ascii="Calibri" w:eastAsia="Calibri" w:hAnsi="Calibri" w:cs="Calibri"/>
+                <w:b/>
+              </w:rPr>
+              <w:t xml:space="preserve">{% if indirizzo == 'SCIENTIFICO_INFORMATICA' %}▣{% else %}☐{% endif %} INFORMATICA</w:t>
             </w:r>
           </w:p>
         </w:tc>
@@ -2590,7 +1812,11 @@
               <w:right w:w="80" w:type="dxa"/>
             </w:tcMar>
           </w:tcPr>
-          <w:p/>
+          <w:p>
+            <w:r>
+              <w:t xml:space="preserve">{%tr for ufc in ufcs %}</w:t>
+            </w:r>
+          </w:p>
         </w:tc>
         <w:tc>
           <w:tcPr>
@@ -2760,7 +1986,11 @@
               <w:right w:w="80" w:type="dxa"/>
             </w:tcMar>
           </w:tcPr>
-          <w:p/>
+          <w:p>
+            <w:r>
+              <w:t xml:space="preserve">{{ufc.numero}}</w:t>
+            </w:r>
+          </w:p>
         </w:tc>
         <w:tc>
           <w:tcPr>
@@ -2779,7 +2009,11 @@
               <w:right w:w="80" w:type="dxa"/>
             </w:tcMar>
           </w:tcPr>
-          <w:p/>
+          <w:p>
+            <w:r>
+              <w:t xml:space="preserve">{{ufc.descrizione}}</w:t>
+            </w:r>
+          </w:p>
         </w:tc>
         <w:tc>
           <w:tcPr>
@@ -2791,7 +2025,11 @@
               <w:right w:val="single" w:sz="4" w:space="0" w:color="000000"/>
             </w:tcBorders>
           </w:tcPr>
-          <w:p/>
+          <w:p>
+            <w:r>
+              <w:t xml:space="preserve">{{ufc.periodo}}</w:t>
+            </w:r>
+          </w:p>
         </w:tc>
         <w:tc>
           <w:tcPr>
@@ -2810,7 +2048,11 @@
               <w:right w:w="80" w:type="dxa"/>
             </w:tcMar>
           </w:tcPr>
-          <w:p/>
+          <w:p>
+            <w:r>
+              <w:t xml:space="preserve">{{ufc.competenze_disciplinari}}</w:t>
+            </w:r>
+          </w:p>
         </w:tc>
         <w:tc>
           <w:tcPr>
@@ -2829,7 +2071,11 @@
               <w:right w:w="80" w:type="dxa"/>
             </w:tcMar>
           </w:tcPr>
-          <w:p/>
+          <w:p>
+            <w:r>
+              <w:t xml:space="preserve">{{ufc.abilita}}</w:t>
+            </w:r>
+          </w:p>
         </w:tc>
         <w:tc>
           <w:tcPr>
@@ -2848,7 +2094,11 @@
               <w:right w:w="80" w:type="dxa"/>
             </w:tcMar>
           </w:tcPr>
-          <w:p/>
+          <w:p>
+            <w:r>
+              <w:t xml:space="preserve">{{ufc.conoscenze}}</w:t>
+            </w:r>
+          </w:p>
         </w:tc>
         <w:tc>
           <w:tcPr>
@@ -2867,7 +2117,11 @@
               <w:right w:w="80" w:type="dxa"/>
             </w:tcMar>
           </w:tcPr>
-          <w:p/>
+          <w:p>
+            <w:r>
+              <w:t xml:space="preserve">{{ufc.competenze_civica}}</w:t>
+            </w:r>
+          </w:p>
         </w:tc>
         <w:tc>
           <w:tcPr>
@@ -2886,7 +2140,11 @@
               <w:right w:w="80" w:type="dxa"/>
             </w:tcMar>
           </w:tcPr>
-          <w:p/>
+          <w:p>
+            <w:r>
+              <w:t xml:space="preserve">{{ufc.verifiche_num}}</w:t>
+            </w:r>
+          </w:p>
         </w:tc>
         <w:tc>
           <w:tcPr>
@@ -2905,7 +2163,11 @@
               <w:right w:w="80" w:type="dxa"/>
             </w:tcMar>
           </w:tcPr>
-          <w:p/>
+          <w:p>
+            <w:r>
+              <w:t xml:space="preserve">{{ufc.verifiche_strumenti}}</w:t>
+            </w:r>
+          </w:p>
         </w:tc>
       </w:tr>
       <w:tr>
@@ -2930,11 +2192,46 @@
               <w:right w:w="80" w:type="dxa"/>
             </w:tcMar>
           </w:tcPr>
+          <w:p>
+            <w:r>
+              <w:t xml:space="preserve">{%tr endfor %}</w:t>
+            </w:r>
+          </w:p>
+        </w:tc>
+        <w:tc>
+          <w:tcPr>
+            <w:tcW w:w="1765" w:type="dxa"/>
+            <w:tcBorders>
+              <w:top w:val="single" w:sz="4" w:space="0" w:color="000000"/>
+              <w:left w:val="single" w:sz="4" w:space="0" w:color="000000"/>
+              <w:bottom w:val="single" w:sz="4" w:space="0" w:color="000000"/>
+              <w:right w:val="single" w:sz="4" w:space="0" w:color="000000"/>
+            </w:tcBorders>
+            <w:shd w:val="clear" w:color="auto" w:fill="auto"/>
+            <w:tcMar>
+              <w:top w:w="80" w:type="dxa"/>
+              <w:left w:w="80" w:type="dxa"/>
+              <w:bottom w:w="80" w:type="dxa"/>
+              <w:right w:w="80" w:type="dxa"/>
+            </w:tcMar>
+          </w:tcPr>
           <w:p/>
         </w:tc>
         <w:tc>
           <w:tcPr>
-            <w:tcW w:w="1765" w:type="dxa"/>
+            <w:tcW w:w="2225" w:type="dxa"/>
+            <w:tcBorders>
+              <w:top w:val="single" w:sz="4" w:space="0" w:color="000000"/>
+              <w:left w:val="single" w:sz="4" w:space="0" w:color="000000"/>
+              <w:bottom w:val="single" w:sz="4" w:space="0" w:color="000000"/>
+              <w:right w:val="single" w:sz="4" w:space="0" w:color="000000"/>
+            </w:tcBorders>
+          </w:tcPr>
+          <w:p/>
+        </w:tc>
+        <w:tc>
+          <w:tcPr>
+            <w:tcW w:w="2364" w:type="dxa"/>
             <w:tcBorders>
               <w:top w:val="single" w:sz="4" w:space="0" w:color="000000"/>
               <w:left w:val="single" w:sz="4" w:space="0" w:color="000000"/>
@@ -2953,19 +2250,26 @@
         </w:tc>
         <w:tc>
           <w:tcPr>
-            <w:tcW w:w="2225" w:type="dxa"/>
-            <w:tcBorders>
-              <w:top w:val="single" w:sz="4" w:space="0" w:color="000000"/>
-              <w:left w:val="single" w:sz="4" w:space="0" w:color="000000"/>
-              <w:bottom w:val="single" w:sz="4" w:space="0" w:color="000000"/>
-              <w:right w:val="single" w:sz="4" w:space="0" w:color="000000"/>
-            </w:tcBorders>
+            <w:tcW w:w="1946" w:type="dxa"/>
+            <w:tcBorders>
+              <w:top w:val="single" w:sz="4" w:space="0" w:color="000000"/>
+              <w:left w:val="single" w:sz="4" w:space="0" w:color="000000"/>
+              <w:bottom w:val="single" w:sz="4" w:space="0" w:color="000000"/>
+              <w:right w:val="single" w:sz="4" w:space="0" w:color="000000"/>
+            </w:tcBorders>
+            <w:shd w:val="clear" w:color="auto" w:fill="auto"/>
+            <w:tcMar>
+              <w:top w:w="80" w:type="dxa"/>
+              <w:left w:w="80" w:type="dxa"/>
+              <w:bottom w:w="80" w:type="dxa"/>
+              <w:right w:w="80" w:type="dxa"/>
+            </w:tcMar>
           </w:tcPr>
           <w:p/>
         </w:tc>
         <w:tc>
           <w:tcPr>
-            <w:tcW w:w="2364" w:type="dxa"/>
+            <w:tcW w:w="1868" w:type="dxa"/>
             <w:tcBorders>
               <w:top w:val="single" w:sz="4" w:space="0" w:color="000000"/>
               <w:left w:val="single" w:sz="4" w:space="0" w:color="000000"/>
@@ -2984,7 +2288,7 @@
         </w:tc>
         <w:tc>
           <w:tcPr>
-            <w:tcW w:w="1946" w:type="dxa"/>
+            <w:tcW w:w="2004" w:type="dxa"/>
             <w:tcBorders>
               <w:top w:val="single" w:sz="4" w:space="0" w:color="000000"/>
               <w:left w:val="single" w:sz="4" w:space="0" w:color="000000"/>
@@ -2995,554 +2299,6 @@
             <w:tcMar>
               <w:top w:w="80" w:type="dxa"/>
               <w:left w:w="80" w:type="dxa"/>
-              <w:bottom w:w="80" w:type="dxa"/>
-              <w:right w:w="80" w:type="dxa"/>
-            </w:tcMar>
-          </w:tcPr>
-          <w:p/>
-        </w:tc>
-        <w:tc>
-          <w:tcPr>
-            <w:tcW w:w="1868" w:type="dxa"/>
-            <w:tcBorders>
-              <w:top w:val="single" w:sz="4" w:space="0" w:color="000000"/>
-              <w:left w:val="single" w:sz="4" w:space="0" w:color="000000"/>
-              <w:bottom w:val="single" w:sz="4" w:space="0" w:color="000000"/>
-              <w:right w:val="single" w:sz="4" w:space="0" w:color="000000"/>
-            </w:tcBorders>
-            <w:shd w:val="clear" w:color="auto" w:fill="auto"/>
-            <w:tcMar>
-              <w:top w:w="80" w:type="dxa"/>
-              <w:left w:w="80" w:type="dxa"/>
-              <w:bottom w:w="80" w:type="dxa"/>
-              <w:right w:w="80" w:type="dxa"/>
-            </w:tcMar>
-          </w:tcPr>
-          <w:p/>
-        </w:tc>
-        <w:tc>
-          <w:tcPr>
-            <w:tcW w:w="2004" w:type="dxa"/>
-            <w:tcBorders>
-              <w:top w:val="single" w:sz="4" w:space="0" w:color="000000"/>
-              <w:left w:val="single" w:sz="4" w:space="0" w:color="000000"/>
-              <w:bottom w:val="single" w:sz="4" w:space="0" w:color="000000"/>
-              <w:right w:val="single" w:sz="4" w:space="0" w:color="000000"/>
-            </w:tcBorders>
-            <w:shd w:val="clear" w:color="auto" w:fill="auto"/>
-            <w:tcMar>
-              <w:top w:w="80" w:type="dxa"/>
-              <w:left w:w="80" w:type="dxa"/>
-              <w:bottom w:w="80" w:type="dxa"/>
-              <w:right w:w="80" w:type="dxa"/>
-            </w:tcMar>
-          </w:tcPr>
-          <w:p/>
-        </w:tc>
-        <w:tc>
-          <w:tcPr>
-            <w:tcW w:w="1000" w:type="dxa"/>
-            <w:tcBorders>
-              <w:top w:val="single" w:sz="4" w:space="0" w:color="000000"/>
-              <w:left w:val="single" w:sz="4" w:space="0" w:color="000000"/>
-              <w:bottom w:val="single" w:sz="4" w:space="0" w:color="000000"/>
-              <w:right w:val="single" w:sz="4" w:space="0" w:color="000000"/>
-            </w:tcBorders>
-            <w:shd w:val="clear" w:color="auto" w:fill="auto"/>
-            <w:tcMar>
-              <w:top w:w="80" w:type="dxa"/>
-              <w:left w:w="477" w:type="dxa"/>
-              <w:bottom w:w="80" w:type="dxa"/>
-              <w:right w:w="80" w:type="dxa"/>
-            </w:tcMar>
-          </w:tcPr>
-          <w:p/>
-        </w:tc>
-        <w:tc>
-          <w:tcPr>
-            <w:tcW w:w="1966" w:type="dxa"/>
-            <w:tcBorders>
-              <w:top w:val="single" w:sz="4" w:space="0" w:color="000000"/>
-              <w:left w:val="single" w:sz="4" w:space="0" w:color="000000"/>
-              <w:bottom w:val="single" w:sz="4" w:space="0" w:color="000000"/>
-              <w:right w:val="single" w:sz="4" w:space="0" w:color="000000"/>
-            </w:tcBorders>
-            <w:shd w:val="clear" w:color="auto" w:fill="auto"/>
-            <w:tcMar>
-              <w:top w:w="80" w:type="dxa"/>
-              <w:left w:w="477" w:type="dxa"/>
-              <w:bottom w:w="80" w:type="dxa"/>
-              <w:right w:w="80" w:type="dxa"/>
-            </w:tcMar>
-          </w:tcPr>
-          <w:p/>
-        </w:tc>
-      </w:tr>
-      <w:tr>
-        <w:trPr>
-          <w:trHeight w:val="538"/>
-          <w:jc w:val="center"/>
-        </w:trPr>
-        <w:tc>
-          <w:tcPr>
-            <w:tcW w:w="1150" w:type="dxa"/>
-            <w:tcBorders>
-              <w:top w:val="single" w:sz="4" w:space="0" w:color="000000"/>
-              <w:left w:val="single" w:sz="4" w:space="0" w:color="000000"/>
-              <w:bottom w:val="single" w:sz="4" w:space="0" w:color="000000"/>
-              <w:right w:val="single" w:sz="4" w:space="0" w:color="000000"/>
-            </w:tcBorders>
-            <w:shd w:val="clear" w:color="auto" w:fill="auto"/>
-            <w:tcMar>
-              <w:top w:w="80" w:type="dxa"/>
-              <w:left w:w="80" w:type="dxa"/>
-              <w:bottom w:w="80" w:type="dxa"/>
-              <w:right w:w="80" w:type="dxa"/>
-            </w:tcMar>
-          </w:tcPr>
-          <w:p/>
-        </w:tc>
-        <w:tc>
-          <w:tcPr>
-            <w:tcW w:w="1765" w:type="dxa"/>
-            <w:tcBorders>
-              <w:top w:val="single" w:sz="4" w:space="0" w:color="000000"/>
-              <w:left w:val="single" w:sz="4" w:space="0" w:color="000000"/>
-              <w:bottom w:val="single" w:sz="4" w:space="0" w:color="000000"/>
-              <w:right w:val="single" w:sz="4" w:space="0" w:color="000000"/>
-            </w:tcBorders>
-            <w:shd w:val="clear" w:color="auto" w:fill="auto"/>
-            <w:tcMar>
-              <w:top w:w="80" w:type="dxa"/>
-              <w:left w:w="80" w:type="dxa"/>
-              <w:bottom w:w="80" w:type="dxa"/>
-              <w:right w:w="80" w:type="dxa"/>
-            </w:tcMar>
-          </w:tcPr>
-          <w:p/>
-        </w:tc>
-        <w:tc>
-          <w:tcPr>
-            <w:tcW w:w="2225" w:type="dxa"/>
-            <w:tcBorders>
-              <w:top w:val="single" w:sz="4" w:space="0" w:color="000000"/>
-              <w:left w:val="single" w:sz="4" w:space="0" w:color="000000"/>
-              <w:bottom w:val="single" w:sz="4" w:space="0" w:color="000000"/>
-              <w:right w:val="single" w:sz="4" w:space="0" w:color="000000"/>
-            </w:tcBorders>
-          </w:tcPr>
-          <w:p/>
-        </w:tc>
-        <w:tc>
-          <w:tcPr>
-            <w:tcW w:w="2364" w:type="dxa"/>
-            <w:tcBorders>
-              <w:top w:val="single" w:sz="4" w:space="0" w:color="000000"/>
-              <w:left w:val="single" w:sz="4" w:space="0" w:color="000000"/>
-              <w:bottom w:val="single" w:sz="4" w:space="0" w:color="000000"/>
-              <w:right w:val="single" w:sz="4" w:space="0" w:color="000000"/>
-            </w:tcBorders>
-            <w:shd w:val="clear" w:color="auto" w:fill="auto"/>
-            <w:tcMar>
-              <w:top w:w="80" w:type="dxa"/>
-              <w:left w:w="477" w:type="dxa"/>
-              <w:bottom w:w="80" w:type="dxa"/>
-              <w:right w:w="80" w:type="dxa"/>
-            </w:tcMar>
-          </w:tcPr>
-          <w:p/>
-        </w:tc>
-        <w:tc>
-          <w:tcPr>
-            <w:tcW w:w="1946" w:type="dxa"/>
-            <w:tcBorders>
-              <w:top w:val="single" w:sz="4" w:space="0" w:color="000000"/>
-              <w:left w:val="single" w:sz="4" w:space="0" w:color="000000"/>
-              <w:bottom w:val="single" w:sz="4" w:space="0" w:color="000000"/>
-              <w:right w:val="single" w:sz="4" w:space="0" w:color="000000"/>
-            </w:tcBorders>
-            <w:shd w:val="clear" w:color="auto" w:fill="auto"/>
-            <w:tcMar>
-              <w:top w:w="80" w:type="dxa"/>
-              <w:left w:w="477" w:type="dxa"/>
-              <w:bottom w:w="80" w:type="dxa"/>
-              <w:right w:w="80" w:type="dxa"/>
-            </w:tcMar>
-          </w:tcPr>
-          <w:p/>
-        </w:tc>
-        <w:tc>
-          <w:tcPr>
-            <w:tcW w:w="1868" w:type="dxa"/>
-            <w:tcBorders>
-              <w:top w:val="single" w:sz="4" w:space="0" w:color="000000"/>
-              <w:left w:val="single" w:sz="4" w:space="0" w:color="000000"/>
-              <w:bottom w:val="single" w:sz="4" w:space="0" w:color="000000"/>
-              <w:right w:val="single" w:sz="4" w:space="0" w:color="000000"/>
-            </w:tcBorders>
-            <w:shd w:val="clear" w:color="auto" w:fill="auto"/>
-            <w:tcMar>
-              <w:top w:w="80" w:type="dxa"/>
-              <w:left w:w="477" w:type="dxa"/>
-              <w:bottom w:w="80" w:type="dxa"/>
-              <w:right w:w="80" w:type="dxa"/>
-            </w:tcMar>
-          </w:tcPr>
-          <w:p/>
-        </w:tc>
-        <w:tc>
-          <w:tcPr>
-            <w:tcW w:w="2004" w:type="dxa"/>
-            <w:tcBorders>
-              <w:top w:val="single" w:sz="4" w:space="0" w:color="000000"/>
-              <w:left w:val="single" w:sz="4" w:space="0" w:color="000000"/>
-              <w:bottom w:val="single" w:sz="4" w:space="0" w:color="000000"/>
-              <w:right w:val="single" w:sz="4" w:space="0" w:color="000000"/>
-            </w:tcBorders>
-            <w:shd w:val="clear" w:color="auto" w:fill="auto"/>
-            <w:tcMar>
-              <w:top w:w="80" w:type="dxa"/>
-              <w:left w:w="477" w:type="dxa"/>
-              <w:bottom w:w="80" w:type="dxa"/>
-              <w:right w:w="80" w:type="dxa"/>
-            </w:tcMar>
-          </w:tcPr>
-          <w:p/>
-        </w:tc>
-        <w:tc>
-          <w:tcPr>
-            <w:tcW w:w="1000" w:type="dxa"/>
-            <w:tcBorders>
-              <w:top w:val="single" w:sz="4" w:space="0" w:color="000000"/>
-              <w:left w:val="single" w:sz="4" w:space="0" w:color="000000"/>
-              <w:bottom w:val="single" w:sz="4" w:space="0" w:color="000000"/>
-              <w:right w:val="single" w:sz="4" w:space="0" w:color="000000"/>
-            </w:tcBorders>
-            <w:shd w:val="clear" w:color="auto" w:fill="auto"/>
-            <w:tcMar>
-              <w:top w:w="80" w:type="dxa"/>
-              <w:left w:w="477" w:type="dxa"/>
-              <w:bottom w:w="80" w:type="dxa"/>
-              <w:right w:w="80" w:type="dxa"/>
-            </w:tcMar>
-          </w:tcPr>
-          <w:p/>
-        </w:tc>
-        <w:tc>
-          <w:tcPr>
-            <w:tcW w:w="1966" w:type="dxa"/>
-            <w:tcBorders>
-              <w:top w:val="single" w:sz="4" w:space="0" w:color="000000"/>
-              <w:left w:val="single" w:sz="4" w:space="0" w:color="000000"/>
-              <w:bottom w:val="single" w:sz="4" w:space="0" w:color="000000"/>
-              <w:right w:val="single" w:sz="4" w:space="0" w:color="000000"/>
-            </w:tcBorders>
-            <w:shd w:val="clear" w:color="auto" w:fill="auto"/>
-            <w:tcMar>
-              <w:top w:w="80" w:type="dxa"/>
-              <w:left w:w="477" w:type="dxa"/>
-              <w:bottom w:w="80" w:type="dxa"/>
-              <w:right w:w="80" w:type="dxa"/>
-            </w:tcMar>
-          </w:tcPr>
-          <w:p/>
-        </w:tc>
-      </w:tr>
-      <w:tr>
-        <w:trPr>
-          <w:trHeight w:val="538"/>
-          <w:jc w:val="center"/>
-        </w:trPr>
-        <w:tc>
-          <w:tcPr>
-            <w:tcW w:w="1150" w:type="dxa"/>
-            <w:tcBorders>
-              <w:top w:val="single" w:sz="4" w:space="0" w:color="000000"/>
-              <w:left w:val="single" w:sz="4" w:space="0" w:color="000000"/>
-              <w:bottom w:val="single" w:sz="4" w:space="0" w:color="000000"/>
-              <w:right w:val="single" w:sz="4" w:space="0" w:color="000000"/>
-            </w:tcBorders>
-            <w:shd w:val="clear" w:color="auto" w:fill="auto"/>
-            <w:tcMar>
-              <w:top w:w="80" w:type="dxa"/>
-              <w:left w:w="80" w:type="dxa"/>
-              <w:bottom w:w="80" w:type="dxa"/>
-              <w:right w:w="80" w:type="dxa"/>
-            </w:tcMar>
-          </w:tcPr>
-          <w:p/>
-        </w:tc>
-        <w:tc>
-          <w:tcPr>
-            <w:tcW w:w="1765" w:type="dxa"/>
-            <w:tcBorders>
-              <w:top w:val="single" w:sz="4" w:space="0" w:color="000000"/>
-              <w:left w:val="single" w:sz="4" w:space="0" w:color="000000"/>
-              <w:bottom w:val="single" w:sz="4" w:space="0" w:color="000000"/>
-              <w:right w:val="single" w:sz="4" w:space="0" w:color="000000"/>
-            </w:tcBorders>
-            <w:shd w:val="clear" w:color="auto" w:fill="auto"/>
-            <w:tcMar>
-              <w:top w:w="80" w:type="dxa"/>
-              <w:left w:w="80" w:type="dxa"/>
-              <w:bottom w:w="80" w:type="dxa"/>
-              <w:right w:w="80" w:type="dxa"/>
-            </w:tcMar>
-          </w:tcPr>
-          <w:p/>
-        </w:tc>
-        <w:tc>
-          <w:tcPr>
-            <w:tcW w:w="2225" w:type="dxa"/>
-            <w:tcBorders>
-              <w:top w:val="single" w:sz="4" w:space="0" w:color="000000"/>
-              <w:left w:val="single" w:sz="4" w:space="0" w:color="000000"/>
-              <w:bottom w:val="single" w:sz="4" w:space="0" w:color="000000"/>
-              <w:right w:val="single" w:sz="4" w:space="0" w:color="000000"/>
-            </w:tcBorders>
-          </w:tcPr>
-          <w:p/>
-        </w:tc>
-        <w:tc>
-          <w:tcPr>
-            <w:tcW w:w="2364" w:type="dxa"/>
-            <w:tcBorders>
-              <w:top w:val="single" w:sz="4" w:space="0" w:color="000000"/>
-              <w:left w:val="single" w:sz="4" w:space="0" w:color="000000"/>
-              <w:bottom w:val="single" w:sz="4" w:space="0" w:color="000000"/>
-              <w:right w:val="single" w:sz="4" w:space="0" w:color="000000"/>
-            </w:tcBorders>
-            <w:shd w:val="clear" w:color="auto" w:fill="auto"/>
-            <w:tcMar>
-              <w:top w:w="80" w:type="dxa"/>
-              <w:left w:w="477" w:type="dxa"/>
-              <w:bottom w:w="80" w:type="dxa"/>
-              <w:right w:w="80" w:type="dxa"/>
-            </w:tcMar>
-          </w:tcPr>
-          <w:p/>
-        </w:tc>
-        <w:tc>
-          <w:tcPr>
-            <w:tcW w:w="1946" w:type="dxa"/>
-            <w:tcBorders>
-              <w:top w:val="single" w:sz="4" w:space="0" w:color="000000"/>
-              <w:left w:val="single" w:sz="4" w:space="0" w:color="000000"/>
-              <w:bottom w:val="single" w:sz="4" w:space="0" w:color="000000"/>
-              <w:right w:val="single" w:sz="4" w:space="0" w:color="000000"/>
-            </w:tcBorders>
-            <w:shd w:val="clear" w:color="auto" w:fill="auto"/>
-            <w:tcMar>
-              <w:top w:w="80" w:type="dxa"/>
-              <w:left w:w="477" w:type="dxa"/>
-              <w:bottom w:w="80" w:type="dxa"/>
-              <w:right w:w="80" w:type="dxa"/>
-            </w:tcMar>
-          </w:tcPr>
-          <w:p/>
-        </w:tc>
-        <w:tc>
-          <w:tcPr>
-            <w:tcW w:w="1868" w:type="dxa"/>
-            <w:tcBorders>
-              <w:top w:val="single" w:sz="4" w:space="0" w:color="000000"/>
-              <w:left w:val="single" w:sz="4" w:space="0" w:color="000000"/>
-              <w:bottom w:val="single" w:sz="4" w:space="0" w:color="000000"/>
-              <w:right w:val="single" w:sz="4" w:space="0" w:color="000000"/>
-            </w:tcBorders>
-            <w:shd w:val="clear" w:color="auto" w:fill="auto"/>
-            <w:tcMar>
-              <w:top w:w="80" w:type="dxa"/>
-              <w:left w:w="477" w:type="dxa"/>
-              <w:bottom w:w="80" w:type="dxa"/>
-              <w:right w:w="80" w:type="dxa"/>
-            </w:tcMar>
-          </w:tcPr>
-          <w:p/>
-        </w:tc>
-        <w:tc>
-          <w:tcPr>
-            <w:tcW w:w="2004" w:type="dxa"/>
-            <w:tcBorders>
-              <w:top w:val="single" w:sz="4" w:space="0" w:color="000000"/>
-              <w:left w:val="single" w:sz="4" w:space="0" w:color="000000"/>
-              <w:bottom w:val="single" w:sz="4" w:space="0" w:color="000000"/>
-              <w:right w:val="single" w:sz="4" w:space="0" w:color="000000"/>
-            </w:tcBorders>
-            <w:shd w:val="clear" w:color="auto" w:fill="auto"/>
-            <w:tcMar>
-              <w:top w:w="80" w:type="dxa"/>
-              <w:left w:w="477" w:type="dxa"/>
-              <w:bottom w:w="80" w:type="dxa"/>
-              <w:right w:w="80" w:type="dxa"/>
-            </w:tcMar>
-          </w:tcPr>
-          <w:p/>
-        </w:tc>
-        <w:tc>
-          <w:tcPr>
-            <w:tcW w:w="1000" w:type="dxa"/>
-            <w:tcBorders>
-              <w:top w:val="single" w:sz="4" w:space="0" w:color="000000"/>
-              <w:left w:val="single" w:sz="4" w:space="0" w:color="000000"/>
-              <w:bottom w:val="single" w:sz="4" w:space="0" w:color="000000"/>
-              <w:right w:val="single" w:sz="4" w:space="0" w:color="000000"/>
-            </w:tcBorders>
-            <w:shd w:val="clear" w:color="auto" w:fill="auto"/>
-            <w:tcMar>
-              <w:top w:w="80" w:type="dxa"/>
-              <w:left w:w="477" w:type="dxa"/>
-              <w:bottom w:w="80" w:type="dxa"/>
-              <w:right w:w="80" w:type="dxa"/>
-            </w:tcMar>
-          </w:tcPr>
-          <w:p/>
-        </w:tc>
-        <w:tc>
-          <w:tcPr>
-            <w:tcW w:w="1966" w:type="dxa"/>
-            <w:tcBorders>
-              <w:top w:val="single" w:sz="4" w:space="0" w:color="000000"/>
-              <w:left w:val="single" w:sz="4" w:space="0" w:color="000000"/>
-              <w:bottom w:val="single" w:sz="4" w:space="0" w:color="000000"/>
-              <w:right w:val="single" w:sz="4" w:space="0" w:color="000000"/>
-            </w:tcBorders>
-            <w:shd w:val="clear" w:color="auto" w:fill="auto"/>
-            <w:tcMar>
-              <w:top w:w="80" w:type="dxa"/>
-              <w:left w:w="477" w:type="dxa"/>
-              <w:bottom w:w="80" w:type="dxa"/>
-              <w:right w:w="80" w:type="dxa"/>
-            </w:tcMar>
-          </w:tcPr>
-          <w:p/>
-        </w:tc>
-      </w:tr>
-      <w:tr>
-        <w:trPr>
-          <w:trHeight w:val="538"/>
-          <w:jc w:val="center"/>
-        </w:trPr>
-        <w:tc>
-          <w:tcPr>
-            <w:tcW w:w="1150" w:type="dxa"/>
-            <w:tcBorders>
-              <w:top w:val="single" w:sz="4" w:space="0" w:color="000000"/>
-              <w:left w:val="single" w:sz="4" w:space="0" w:color="000000"/>
-              <w:bottom w:val="single" w:sz="4" w:space="0" w:color="000000"/>
-              <w:right w:val="single" w:sz="4" w:space="0" w:color="000000"/>
-            </w:tcBorders>
-            <w:shd w:val="clear" w:color="auto" w:fill="auto"/>
-            <w:tcMar>
-              <w:top w:w="80" w:type="dxa"/>
-              <w:left w:w="80" w:type="dxa"/>
-              <w:bottom w:w="80" w:type="dxa"/>
-              <w:right w:w="80" w:type="dxa"/>
-            </w:tcMar>
-          </w:tcPr>
-          <w:p/>
-        </w:tc>
-        <w:tc>
-          <w:tcPr>
-            <w:tcW w:w="1765" w:type="dxa"/>
-            <w:tcBorders>
-              <w:top w:val="single" w:sz="4" w:space="0" w:color="000000"/>
-              <w:left w:val="single" w:sz="4" w:space="0" w:color="000000"/>
-              <w:bottom w:val="single" w:sz="4" w:space="0" w:color="000000"/>
-              <w:right w:val="single" w:sz="4" w:space="0" w:color="000000"/>
-            </w:tcBorders>
-            <w:shd w:val="clear" w:color="auto" w:fill="auto"/>
-            <w:tcMar>
-              <w:top w:w="80" w:type="dxa"/>
-              <w:left w:w="80" w:type="dxa"/>
-              <w:bottom w:w="80" w:type="dxa"/>
-              <w:right w:w="80" w:type="dxa"/>
-            </w:tcMar>
-          </w:tcPr>
-          <w:p/>
-        </w:tc>
-        <w:tc>
-          <w:tcPr>
-            <w:tcW w:w="2225" w:type="dxa"/>
-            <w:tcBorders>
-              <w:top w:val="single" w:sz="4" w:space="0" w:color="000000"/>
-              <w:left w:val="single" w:sz="4" w:space="0" w:color="000000"/>
-              <w:bottom w:val="single" w:sz="4" w:space="0" w:color="000000"/>
-              <w:right w:val="single" w:sz="4" w:space="0" w:color="000000"/>
-            </w:tcBorders>
-          </w:tcPr>
-          <w:p/>
-        </w:tc>
-        <w:tc>
-          <w:tcPr>
-            <w:tcW w:w="2364" w:type="dxa"/>
-            <w:tcBorders>
-              <w:top w:val="single" w:sz="4" w:space="0" w:color="000000"/>
-              <w:left w:val="single" w:sz="4" w:space="0" w:color="000000"/>
-              <w:bottom w:val="single" w:sz="4" w:space="0" w:color="000000"/>
-              <w:right w:val="single" w:sz="4" w:space="0" w:color="000000"/>
-            </w:tcBorders>
-            <w:shd w:val="clear" w:color="auto" w:fill="auto"/>
-            <w:tcMar>
-              <w:top w:w="80" w:type="dxa"/>
-              <w:left w:w="477" w:type="dxa"/>
-              <w:bottom w:w="80" w:type="dxa"/>
-              <w:right w:w="80" w:type="dxa"/>
-            </w:tcMar>
-          </w:tcPr>
-          <w:p/>
-        </w:tc>
-        <w:tc>
-          <w:tcPr>
-            <w:tcW w:w="1946" w:type="dxa"/>
-            <w:tcBorders>
-              <w:top w:val="single" w:sz="4" w:space="0" w:color="000000"/>
-              <w:left w:val="single" w:sz="4" w:space="0" w:color="000000"/>
-              <w:bottom w:val="single" w:sz="4" w:space="0" w:color="000000"/>
-              <w:right w:val="single" w:sz="4" w:space="0" w:color="000000"/>
-            </w:tcBorders>
-            <w:shd w:val="clear" w:color="auto" w:fill="auto"/>
-            <w:tcMar>
-              <w:top w:w="80" w:type="dxa"/>
-              <w:left w:w="477" w:type="dxa"/>
-              <w:bottom w:w="80" w:type="dxa"/>
-              <w:right w:w="80" w:type="dxa"/>
-            </w:tcMar>
-          </w:tcPr>
-          <w:p/>
-        </w:tc>
-        <w:tc>
-          <w:tcPr>
-            <w:tcW w:w="1868" w:type="dxa"/>
-            <w:tcBorders>
-              <w:top w:val="single" w:sz="4" w:space="0" w:color="000000"/>
-              <w:left w:val="single" w:sz="4" w:space="0" w:color="000000"/>
-              <w:bottom w:val="single" w:sz="4" w:space="0" w:color="000000"/>
-              <w:right w:val="single" w:sz="4" w:space="0" w:color="000000"/>
-            </w:tcBorders>
-            <w:shd w:val="clear" w:color="auto" w:fill="auto"/>
-            <w:tcMar>
-              <w:top w:w="80" w:type="dxa"/>
-              <w:left w:w="477" w:type="dxa"/>
-              <w:bottom w:w="80" w:type="dxa"/>
-              <w:right w:w="80" w:type="dxa"/>
-            </w:tcMar>
-          </w:tcPr>
-          <w:p/>
-        </w:tc>
-        <w:tc>
-          <w:tcPr>
-            <w:tcW w:w="2004" w:type="dxa"/>
-            <w:tcBorders>
-              <w:top w:val="single" w:sz="4" w:space="0" w:color="000000"/>
-              <w:left w:val="single" w:sz="4" w:space="0" w:color="000000"/>
-              <w:bottom w:val="single" w:sz="4" w:space="0" w:color="000000"/>
-              <w:right w:val="single" w:sz="4" w:space="0" w:color="000000"/>
-            </w:tcBorders>
-            <w:shd w:val="clear" w:color="auto" w:fill="auto"/>
-            <w:tcMar>
-              <w:top w:w="80" w:type="dxa"/>
-              <w:left w:w="477" w:type="dxa"/>
               <w:bottom w:w="80" w:type="dxa"/>
               <w:right w:w="80" w:type="dxa"/>
             </w:tcMar>

</xml_diff>

<commit_message>
Migra i template e le programmazioni non-SIA al nuovo schema verifiche
Il campo UFC.verifiche_num/verifiche_strumenti (stringhe piatte) è stato
sostituito da UFC.verifiche: List[Verifica] a monte (modello.py/schema
aggiornati da un altro collaboratore). Aggiorna i 6 file dati non-SIA
alla nuova struttura preservando il contenuto originale, e i due
template Triennio/Biennio REV.02 con lo stesso subloop già usato nel
nuovo template SIA. Aggiunge jsonref a requirements.txt (dipendenza
mancante introdotta insieme al nuovo schema) e aggiorna CLAUDE.md.

Co-Authored-By: Claude Sonnet 5 <noreply@anthropic.com>
Claude-Session: https://claude.ai/code/session_01K4ue6iEQnnns7dQFNtDoJa
</commit_message>
<xml_diff>
--- a/templates/MOD_INS_01_A REV.02 Programm. Dipart. Biennio.docx
+++ b/templates/MOD_INS_01_A REV.02 Programm. Dipart. Biennio.docx
@@ -2142,7 +2142,9 @@
           </w:tcPr>
           <w:p>
             <w:r>
-              <w:t xml:space="preserve">{{ufc.verifiche_num}}</w:t>
+              <w:t xml:space="preserve">{% for v in ufc.verifiche %}
+{{ v.tipo }} {{ v.numero }}
+{% endfor %}</w:t>
             </w:r>
           </w:p>
         </w:tc>
@@ -2165,7 +2167,9 @@
           </w:tcPr>
           <w:p>
             <w:r>
-              <w:t xml:space="preserve">{{ufc.verifiche_strumenti}}</w:t>
+              <w:t xml:space="preserve">{% for v in ufc.verifiche %}
+{{ v.strumenti }}
+{% endfor %}</w:t>
             </w:r>
           </w:p>
         </w:tc>

</xml_diff>